<commit_message>
Implement hardcoded Aegis comparison scenarios and orthoganal attack
</commit_message>
<xml_diff>
--- a/My Notes/Application devep.docx
+++ b/My Notes/Application devep.docx
@@ -1951,6 +1951,1699 @@
           <w:u w:val="none"/>
         </w:rPr>
         <w:t>Would you like to proceed with configuring the "Operation Sentinel" demo code with this Robustness-First mindset?</w:t>
+      </w:r>
+    </w:p>
+    <w:p>
+      <w:pPr>
+        <w:rPr>
+          <w:u w:val="none"/>
+        </w:rPr>
+      </w:pPr>
+      <w:r>
+        <w:rPr>
+          <w:u w:val="none"/>
+        </w:rPr>
+        <w:br w:type="page"/>
+      </w:r>
+    </w:p>
+    <w:p>
+      <w:pPr>
+        <w:rPr>
+          <w:u w:val="none"/>
+        </w:rPr>
+      </w:pPr>
+      <w:r>
+        <w:rPr>
+          <w:u w:val="none"/>
+        </w:rPr>
+        <w:lastRenderedPageBreak/>
+        <w:t>This is a fantastic concept! "Operation Sentinel" provides a compelling, real-world narrative for your research.</w:t>
+      </w:r>
+    </w:p>
+    <w:p>
+      <w:pPr>
+        <w:rPr>
+          <w:u w:val="none"/>
+        </w:rPr>
+      </w:pPr>
+      <w:r>
+        <w:rPr>
+          <w:u w:val="none"/>
+        </w:rPr>
+        <w:t>Here is the feasibility analysis and implementation plan for building this application on your current codebase.</w:t>
+      </w:r>
+    </w:p>
+    <w:p>
+      <w:pPr>
+        <w:rPr>
+          <w:b/>
+          <w:u w:val="none"/>
+        </w:rPr>
+      </w:pPr>
+      <w:r>
+        <w:rPr>
+          <w:b/>
+          <w:u w:val="none"/>
+        </w:rPr>
+        <w:t>1. Feasibility Analysis</w:t>
+      </w:r>
+    </w:p>
+    <w:p>
+      <w:pPr>
+        <w:rPr>
+          <w:u w:val="none"/>
+        </w:rPr>
+      </w:pPr>
+      <w:r>
+        <w:rPr>
+          <w:b/>
+          <w:u w:val="none"/>
+        </w:rPr>
+        <w:t>Efficiency:</w:t>
+      </w:r>
+      <w:r>
+        <w:rPr>
+          <w:u w:val="none"/>
+        </w:rPr>
+        <w:t> </w:t>
+      </w:r>
+      <w:r>
+        <w:rPr>
+          <w:b/>
+          <w:u w:val="none"/>
+        </w:rPr>
+        <w:t>Very High</w:t>
+      </w:r>
+      <w:r>
+        <w:rPr>
+          <w:u w:val="none"/>
+        </w:rPr>
+        <w:t>. Your current codebase (</w:t>
+      </w:r>
+    </w:p>
+    <w:p>
+      <w:pPr>
+        <w:rPr>
+          <w:u w:val="none"/>
+        </w:rPr>
+      </w:pPr>
+      <w:r>
+        <w:rPr>
+          <w:u w:val="none"/>
+        </w:rPr>
+        <w:t>Server, </w:t>
+      </w:r>
+    </w:p>
+    <w:p>
+      <w:pPr>
+        <w:rPr>
+          <w:u w:val="none"/>
+        </w:rPr>
+      </w:pPr>
+      <w:r>
+        <w:rPr>
+          <w:u w:val="none"/>
+        </w:rPr>
+        <w:t>Client, </w:t>
+      </w:r>
+    </w:p>
+    <w:p>
+      <w:pPr>
+        <w:rPr>
+          <w:u w:val="none"/>
+        </w:rPr>
+      </w:pPr>
+      <w:r>
+        <w:rPr>
+          <w:u w:val="none"/>
+        </w:rPr>
+        <w:t>Aegis</w:t>
+      </w:r>
+    </w:p>
+    <w:p>
+      <w:pPr>
+        <w:rPr>
+          <w:u w:val="none"/>
+        </w:rPr>
+      </w:pPr>
+      <w:r>
+        <w:rPr>
+          <w:u w:val="none"/>
+        </w:rPr>
+        <w:t>, </w:t>
+      </w:r>
+    </w:p>
+    <w:p>
+      <w:pPr>
+        <w:rPr>
+          <w:u w:val="none"/>
+        </w:rPr>
+      </w:pPr>
+      <w:r>
+        <w:rPr>
+          <w:u w:val="none"/>
+        </w:rPr>
+        <w:t>Model</w:t>
+      </w:r>
+    </w:p>
+    <w:p>
+      <w:pPr>
+        <w:rPr>
+          <w:u w:val="none"/>
+        </w:rPr>
+      </w:pPr>
+      <w:r>
+        <w:rPr>
+          <w:u w:val="none"/>
+        </w:rPr>
+        <w:t xml:space="preserve">) </w:t>
+      </w:r>
+      <w:proofErr w:type="gramStart"/>
+      <w:r>
+        <w:rPr>
+          <w:u w:val="none"/>
+        </w:rPr>
+        <w:t>effectively</w:t>
+      </w:r>
+      <w:proofErr w:type="gramEnd"/>
+      <w:r>
+        <w:rPr>
+          <w:u w:val="none"/>
+        </w:rPr>
+        <w:t xml:space="preserve"> provides 90% of the backend logic needed for "Operation Sentinel".</w:t>
+      </w:r>
+    </w:p>
+    <w:p>
+      <w:pPr>
+        <w:numPr>
+          <w:ilvl w:val="0"/>
+          <w:numId w:val="11"/>
+        </w:numPr>
+        <w:rPr>
+          <w:u w:val="none"/>
+        </w:rPr>
+      </w:pPr>
+      <w:r>
+        <w:rPr>
+          <w:b/>
+          <w:u w:val="none"/>
+        </w:rPr>
+        <w:t>The "Swarm"</w:t>
+      </w:r>
+      <w:r>
+        <w:rPr>
+          <w:u w:val="none"/>
+        </w:rPr>
+        <w:t>: Your </w:t>
+      </w:r>
+    </w:p>
+    <w:p>
+      <w:pPr>
+        <w:rPr>
+          <w:u w:val="none"/>
+        </w:rPr>
+      </w:pPr>
+      <w:r>
+        <w:rPr>
+          <w:u w:val="none"/>
+        </w:rPr>
+        <w:t>Client class already handles local training.</w:t>
+      </w:r>
+    </w:p>
+    <w:p>
+      <w:pPr>
+        <w:numPr>
+          <w:ilvl w:val="0"/>
+          <w:numId w:val="11"/>
+        </w:numPr>
+        <w:rPr>
+          <w:u w:val="none"/>
+        </w:rPr>
+      </w:pPr>
+      <w:r>
+        <w:rPr>
+          <w:b/>
+          <w:u w:val="none"/>
+        </w:rPr>
+        <w:t>The "Commander"</w:t>
+      </w:r>
+      <w:r>
+        <w:rPr>
+          <w:u w:val="none"/>
+        </w:rPr>
+        <w:t>: Your </w:t>
+      </w:r>
+    </w:p>
+    <w:p>
+      <w:pPr>
+        <w:rPr>
+          <w:u w:val="none"/>
+        </w:rPr>
+      </w:pPr>
+      <w:r>
+        <w:rPr>
+          <w:u w:val="none"/>
+        </w:rPr>
+        <w:t>Server class handles aggregation.</w:t>
+      </w:r>
+    </w:p>
+    <w:p>
+      <w:pPr>
+        <w:numPr>
+          <w:ilvl w:val="0"/>
+          <w:numId w:val="11"/>
+        </w:numPr>
+        <w:rPr>
+          <w:u w:val="none"/>
+        </w:rPr>
+      </w:pPr>
+      <w:r>
+        <w:rPr>
+          <w:b/>
+          <w:u w:val="none"/>
+        </w:rPr>
+        <w:t>The "</w:t>
+      </w:r>
+      <w:proofErr w:type="spellStart"/>
+      <w:r>
+        <w:rPr>
+          <w:b/>
+          <w:u w:val="none"/>
+        </w:rPr>
+        <w:t>Defense</w:t>
+      </w:r>
+      <w:proofErr w:type="spellEnd"/>
+      <w:r>
+        <w:rPr>
+          <w:b/>
+          <w:u w:val="none"/>
+        </w:rPr>
+        <w:t>"</w:t>
+      </w:r>
+      <w:r>
+        <w:rPr>
+          <w:u w:val="none"/>
+        </w:rPr>
+        <w:t>: You already have </w:t>
+      </w:r>
+    </w:p>
+    <w:p>
+      <w:pPr>
+        <w:rPr>
+          <w:u w:val="none"/>
+        </w:rPr>
+      </w:pPr>
+      <w:r>
+        <w:rPr>
+          <w:u w:val="none"/>
+        </w:rPr>
+        <w:t>aegis</w:t>
+      </w:r>
+    </w:p>
+    <w:p>
+      <w:pPr>
+        <w:rPr>
+          <w:u w:val="none"/>
+        </w:rPr>
+      </w:pPr>
+      <w:r>
+        <w:rPr>
+          <w:u w:val="none"/>
+        </w:rPr>
+        <w:t> implemented in </w:t>
+      </w:r>
+    </w:p>
+    <w:p>
+      <w:pPr>
+        <w:rPr>
+          <w:u w:val="none"/>
+        </w:rPr>
+      </w:pPr>
+      <w:r>
+        <w:rPr>
+          <w:u w:val="none"/>
+        </w:rPr>
+        <w:t>aggregator.py.</w:t>
+      </w:r>
+    </w:p>
+    <w:p>
+      <w:pPr>
+        <w:numPr>
+          <w:ilvl w:val="0"/>
+          <w:numId w:val="11"/>
+        </w:numPr>
+        <w:rPr>
+          <w:u w:val="none"/>
+        </w:rPr>
+      </w:pPr>
+      <w:r>
+        <w:rPr>
+          <w:b/>
+          <w:u w:val="none"/>
+        </w:rPr>
+        <w:t>The "Ambush"</w:t>
+      </w:r>
+      <w:r>
+        <w:rPr>
+          <w:u w:val="none"/>
+        </w:rPr>
+        <w:t>: Your </w:t>
+      </w:r>
+    </w:p>
+    <w:p>
+      <w:pPr>
+        <w:rPr>
+          <w:u w:val="none"/>
+        </w:rPr>
+      </w:pPr>
+      <w:r>
+        <w:rPr>
+          <w:u w:val="none"/>
+        </w:rPr>
+        <w:t>client.py already supports </w:t>
+      </w:r>
+    </w:p>
+    <w:p>
+      <w:pPr>
+        <w:rPr>
+          <w:u w:val="none"/>
+        </w:rPr>
+      </w:pPr>
+      <w:proofErr w:type="spellStart"/>
+      <w:r>
+        <w:rPr>
+          <w:u w:val="none"/>
+        </w:rPr>
+        <w:t>label_flip</w:t>
+      </w:r>
+      <w:proofErr w:type="spellEnd"/>
+    </w:p>
+    <w:p>
+      <w:pPr>
+        <w:rPr>
+          <w:u w:val="none"/>
+        </w:rPr>
+      </w:pPr>
+      <w:r>
+        <w:rPr>
+          <w:u w:val="none"/>
+        </w:rPr>
+        <w:t> and other attacks.</w:t>
+      </w:r>
+    </w:p>
+    <w:p>
+      <w:pPr>
+        <w:rPr>
+          <w:u w:val="none"/>
+        </w:rPr>
+      </w:pPr>
+      <w:r>
+        <w:rPr>
+          <w:u w:val="none"/>
+        </w:rPr>
+        <w:t>You can rapidly prototype this by reusing these classes as a library.</w:t>
+      </w:r>
+    </w:p>
+    <w:p>
+      <w:pPr>
+        <w:rPr>
+          <w:u w:val="none"/>
+        </w:rPr>
+      </w:pPr>
+      <w:r>
+        <w:rPr>
+          <w:b/>
+          <w:u w:val="none"/>
+        </w:rPr>
+        <w:t>2. Can we use the same </w:t>
+      </w:r>
+    </w:p>
+    <w:p>
+      <w:pPr>
+        <w:rPr>
+          <w:b/>
+          <w:u w:val="none"/>
+        </w:rPr>
+      </w:pPr>
+      <w:r>
+        <w:rPr>
+          <w:u w:val="none"/>
+        </w:rPr>
+        <w:t>main.py</w:t>
+      </w:r>
+      <w:r>
+        <w:rPr>
+          <w:b/>
+          <w:u w:val="none"/>
+        </w:rPr>
+        <w:t>?</w:t>
+      </w:r>
+    </w:p>
+    <w:p>
+      <w:pPr>
+        <w:rPr>
+          <w:u w:val="none"/>
+        </w:rPr>
+      </w:pPr>
+      <w:r>
+        <w:rPr>
+          <w:b/>
+          <w:u w:val="none"/>
+        </w:rPr>
+        <w:t>Short Answer:</w:t>
+      </w:r>
+      <w:r>
+        <w:rPr>
+          <w:u w:val="none"/>
+        </w:rPr>
+        <w:t> It is </w:t>
+      </w:r>
+      <w:r>
+        <w:rPr>
+          <w:b/>
+          <w:u w:val="none"/>
+        </w:rPr>
+        <w:t>NOT recommended</w:t>
+      </w:r>
+      <w:r>
+        <w:rPr>
+          <w:u w:val="none"/>
+        </w:rPr>
+        <w:t> to use the </w:t>
+      </w:r>
+      <w:proofErr w:type="spellStart"/>
+      <w:r>
+        <w:rPr>
+          <w:i/>
+          <w:iCs/>
+          <w:u w:val="none"/>
+        </w:rPr>
+        <w:t>execact</w:t>
+      </w:r>
+      <w:proofErr w:type="spellEnd"/>
+      <w:r>
+        <w:rPr>
+          <w:u w:val="none"/>
+        </w:rPr>
+        <w:t> existing </w:t>
+      </w:r>
+    </w:p>
+    <w:p>
+      <w:pPr>
+        <w:rPr>
+          <w:u w:val="none"/>
+        </w:rPr>
+      </w:pPr>
+      <w:r>
+        <w:rPr>
+          <w:u w:val="none"/>
+        </w:rPr>
+        <w:t>main.py file, but we can reuse 100% of the </w:t>
+      </w:r>
+      <w:r>
+        <w:rPr>
+          <w:i/>
+          <w:iCs/>
+          <w:u w:val="none"/>
+        </w:rPr>
+        <w:t>logic</w:t>
+      </w:r>
+      <w:r>
+        <w:rPr>
+          <w:u w:val="none"/>
+        </w:rPr>
+        <w:t> inside it.</w:t>
+      </w:r>
+    </w:p>
+    <w:p>
+      <w:pPr>
+        <w:rPr>
+          <w:u w:val="none"/>
+        </w:rPr>
+      </w:pPr>
+      <w:r>
+        <w:rPr>
+          <w:b/>
+          <w:u w:val="none"/>
+        </w:rPr>
+        <w:t>Reasoning:</w:t>
+      </w:r>
+    </w:p>
+    <w:p>
+      <w:pPr>
+        <w:numPr>
+          <w:ilvl w:val="0"/>
+          <w:numId w:val="12"/>
+        </w:numPr>
+        <w:rPr>
+          <w:u w:val="none"/>
+        </w:rPr>
+      </w:pPr>
+      <w:r>
+        <w:rPr>
+          <w:b/>
+          <w:u w:val="none"/>
+        </w:rPr>
+        <w:t>Different Flows:</w:t>
+      </w:r>
+      <w:r>
+        <w:rPr>
+          <w:u w:val="none"/>
+        </w:rPr>
+        <w:t> Your current </w:t>
+      </w:r>
+    </w:p>
+    <w:p>
+      <w:pPr>
+        <w:rPr>
+          <w:u w:val="none"/>
+        </w:rPr>
+      </w:pPr>
+      <w:r>
+        <w:rPr>
+          <w:u w:val="none"/>
+        </w:rPr>
+        <w:lastRenderedPageBreak/>
+        <w:t>main.py is a </w:t>
+      </w:r>
+      <w:r>
+        <w:rPr>
+          <w:b/>
+          <w:u w:val="none"/>
+        </w:rPr>
+        <w:t>Batch Experiment Runner</w:t>
+      </w:r>
+      <w:r>
+        <w:rPr>
+          <w:u w:val="none"/>
+        </w:rPr>
+        <w:t>. It is designed to run 1,000 rounds non-stop and plot a static graph. It does not support "pausing" to switch protocols (Phase 3) or "injecting" an attack mid-run (Phase 2).</w:t>
+      </w:r>
+    </w:p>
+    <w:p>
+      <w:pPr>
+        <w:numPr>
+          <w:ilvl w:val="0"/>
+          <w:numId w:val="12"/>
+        </w:numPr>
+        <w:rPr>
+          <w:u w:val="none"/>
+        </w:rPr>
+      </w:pPr>
+      <w:r>
+        <w:rPr>
+          <w:b/>
+          <w:u w:val="none"/>
+        </w:rPr>
+        <w:t>Interactive vs. Static:</w:t>
+      </w:r>
+      <w:r>
+        <w:rPr>
+          <w:u w:val="none"/>
+        </w:rPr>
+        <w:t> "Operation Sentinel" requires an </w:t>
+      </w:r>
+      <w:r>
+        <w:rPr>
+          <w:b/>
+          <w:u w:val="none"/>
+        </w:rPr>
+        <w:t>Interactive Loop</w:t>
+      </w:r>
+      <w:r>
+        <w:rPr>
+          <w:u w:val="none"/>
+        </w:rPr>
+        <w:t> (e.g., waiting for your command to switch to Aegis), whereas </w:t>
+      </w:r>
+    </w:p>
+    <w:p>
+      <w:pPr>
+        <w:rPr>
+          <w:u w:val="none"/>
+        </w:rPr>
+      </w:pPr>
+      <w:r>
+        <w:rPr>
+          <w:u w:val="none"/>
+        </w:rPr>
+        <w:t>main.py is a fully automated loop.</w:t>
+      </w:r>
+    </w:p>
+    <w:p>
+      <w:pPr>
+        <w:rPr>
+          <w:u w:val="none"/>
+        </w:rPr>
+      </w:pPr>
+      <w:r>
+        <w:rPr>
+          <w:b/>
+          <w:u w:val="none"/>
+        </w:rPr>
+        <w:t>Better Solution:</w:t>
+      </w:r>
+      <w:r>
+        <w:rPr>
+          <w:u w:val="none"/>
+        </w:rPr>
+        <w:t> Create a new script (e.g., </w:t>
+      </w:r>
+    </w:p>
+    <w:p>
+      <w:pPr>
+        <w:rPr>
+          <w:u w:val="none"/>
+        </w:rPr>
+      </w:pPr>
+      <w:r>
+        <w:rPr>
+          <w:u w:val="none"/>
+        </w:rPr>
+        <w:t>sentinel_demo.py</w:t>
+      </w:r>
+    </w:p>
+    <w:p>
+      <w:pPr>
+        <w:rPr>
+          <w:u w:val="none"/>
+        </w:rPr>
+      </w:pPr>
+      <w:r>
+        <w:rPr>
+          <w:u w:val="none"/>
+        </w:rPr>
+        <w:t xml:space="preserve">) </w:t>
+      </w:r>
+      <w:proofErr w:type="gramStart"/>
+      <w:r>
+        <w:rPr>
+          <w:u w:val="none"/>
+        </w:rPr>
+        <w:t>in</w:t>
+      </w:r>
+      <w:proofErr w:type="gramEnd"/>
+      <w:r>
+        <w:rPr>
+          <w:u w:val="none"/>
+        </w:rPr>
+        <w:t xml:space="preserve"> your new directory that </w:t>
+      </w:r>
+      <w:r>
+        <w:rPr>
+          <w:b/>
+          <w:u w:val="none"/>
+        </w:rPr>
+        <w:t>imports</w:t>
+      </w:r>
+      <w:r>
+        <w:rPr>
+          <w:u w:val="none"/>
+        </w:rPr>
+        <w:t> </w:t>
+      </w:r>
+    </w:p>
+    <w:p>
+      <w:pPr>
+        <w:rPr>
+          <w:u w:val="none"/>
+        </w:rPr>
+      </w:pPr>
+      <w:r>
+        <w:rPr>
+          <w:u w:val="none"/>
+        </w:rPr>
+        <w:t>Server, </w:t>
+      </w:r>
+    </w:p>
+    <w:p>
+      <w:pPr>
+        <w:rPr>
+          <w:u w:val="none"/>
+        </w:rPr>
+      </w:pPr>
+      <w:r>
+        <w:rPr>
+          <w:u w:val="none"/>
+        </w:rPr>
+        <w:t>Client, and </w:t>
+      </w:r>
+    </w:p>
+    <w:p>
+      <w:pPr>
+        <w:rPr>
+          <w:u w:val="none"/>
+        </w:rPr>
+      </w:pPr>
+      <w:r>
+        <w:rPr>
+          <w:u w:val="none"/>
+        </w:rPr>
+        <w:t>config</w:t>
+      </w:r>
+    </w:p>
+    <w:p>
+      <w:pPr>
+        <w:rPr>
+          <w:u w:val="none"/>
+        </w:rPr>
+      </w:pPr>
+      <w:r>
+        <w:rPr>
+          <w:u w:val="none"/>
+        </w:rPr>
+        <w:t> from </w:t>
+      </w:r>
+    </w:p>
+    <w:p>
+      <w:pPr>
+        <w:rPr>
+          <w:u w:val="none"/>
+        </w:rPr>
+      </w:pPr>
+      <w:proofErr w:type="spellStart"/>
+      <w:r>
+        <w:rPr>
+          <w:u w:val="none"/>
+        </w:rPr>
+        <w:t>FL_Project</w:t>
+      </w:r>
+      <w:proofErr w:type="spellEnd"/>
+    </w:p>
+    <w:p>
+      <w:pPr>
+        <w:rPr>
+          <w:u w:val="none"/>
+        </w:rPr>
+      </w:pPr>
+      <w:r>
+        <w:rPr>
+          <w:u w:val="none"/>
+        </w:rPr>
+        <w:t>. This script will implement the specific "Phase 1 -&gt; Phase 2 -&gt; Phase 3" logic while calling the familiar functions </w:t>
+      </w:r>
+    </w:p>
+    <w:p>
+      <w:pPr>
+        <w:rPr>
+          <w:u w:val="none"/>
+        </w:rPr>
+      </w:pPr>
+      <w:proofErr w:type="spellStart"/>
+      <w:r>
+        <w:rPr>
+          <w:u w:val="none"/>
+        </w:rPr>
+        <w:t>server.run_</w:t>
+      </w:r>
+      <w:proofErr w:type="gramStart"/>
+      <w:r>
+        <w:rPr>
+          <w:u w:val="none"/>
+        </w:rPr>
+        <w:t>round</w:t>
+      </w:r>
+      <w:proofErr w:type="spellEnd"/>
+      <w:r>
+        <w:rPr>
+          <w:u w:val="none"/>
+        </w:rPr>
+        <w:t>(</w:t>
+      </w:r>
+      <w:proofErr w:type="gramEnd"/>
+      <w:r>
+        <w:rPr>
+          <w:u w:val="none"/>
+        </w:rPr>
+        <w:t>)</w:t>
+      </w:r>
+    </w:p>
+    <w:p>
+      <w:pPr>
+        <w:rPr>
+          <w:u w:val="none"/>
+        </w:rPr>
+      </w:pPr>
+      <w:r>
+        <w:rPr>
+          <w:u w:val="none"/>
+        </w:rPr>
+        <w:t> in the background.</w:t>
+      </w:r>
+    </w:p>
+    <w:p>
+      <w:pPr>
+        <w:rPr>
+          <w:b/>
+          <w:u w:val="none"/>
+        </w:rPr>
+      </w:pPr>
+      <w:r>
+        <w:rPr>
+          <w:b/>
+          <w:u w:val="none"/>
+        </w:rPr>
+        <w:t>3. Proposed Project Structure</w:t>
+      </w:r>
+    </w:p>
+    <w:p>
+      <w:pPr>
+        <w:rPr>
+          <w:u w:val="none"/>
+        </w:rPr>
+      </w:pPr>
+      <w:r>
+        <w:rPr>
+          <w:u w:val="none"/>
+        </w:rPr>
+        <w:t>We can keep your code separation clean as requested:</w:t>
+      </w:r>
+    </w:p>
+    <w:p>
+      <w:pPr>
+        <w:rPr>
+          <w:u w:val="none"/>
+        </w:rPr>
+      </w:pPr>
+      <w:r>
+        <w:rPr>
+          <w:u w:val="none"/>
+        </w:rPr>
+        <w:t>text</w:t>
+      </w:r>
+    </w:p>
+    <w:p>
+      <w:pPr>
+        <w:rPr>
+          <w:u w:val="none"/>
+        </w:rPr>
+      </w:pPr>
+      <w:r>
+        <w:rPr>
+          <w:u w:val="none"/>
+        </w:rPr>
+        <w:t>D:\IITD\MTP 2\</w:t>
+      </w:r>
+    </w:p>
+    <w:p>
+      <w:pPr>
+        <w:rPr>
+          <w:u w:val="none"/>
+        </w:rPr>
+      </w:pPr>
+      <w:r>
+        <w:rPr>
+          <w:u w:val="none"/>
+        </w:rPr>
+        <w:t>│</w:t>
+      </w:r>
+    </w:p>
+    <w:p>
+      <w:pPr>
+        <w:rPr>
+          <w:u w:val="none"/>
+        </w:rPr>
+      </w:pPr>
+      <w:r>
+        <w:rPr>
+          <w:u w:val="none"/>
+        </w:rPr>
+        <w:t xml:space="preserve">├── </w:t>
+      </w:r>
+      <w:proofErr w:type="spellStart"/>
+      <w:r>
+        <w:rPr>
+          <w:u w:val="none"/>
+        </w:rPr>
+        <w:t>FL_Project</w:t>
+      </w:r>
+      <w:proofErr w:type="spellEnd"/>
+      <w:r>
+        <w:rPr>
+          <w:u w:val="none"/>
+        </w:rPr>
+        <w:t>/               # &lt;--- CORE ENGINE (Existing)</w:t>
+      </w:r>
+    </w:p>
+    <w:p>
+      <w:pPr>
+        <w:rPr>
+          <w:u w:val="none"/>
+        </w:rPr>
+      </w:pPr>
+      <w:r>
+        <w:rPr>
+          <w:u w:val="none"/>
+        </w:rPr>
+        <w:t>│   ├── server.py             # Reused</w:t>
+      </w:r>
+    </w:p>
+    <w:p>
+      <w:pPr>
+        <w:rPr>
+          <w:u w:val="none"/>
+        </w:rPr>
+      </w:pPr>
+      <w:r>
+        <w:rPr>
+          <w:u w:val="none"/>
+        </w:rPr>
+        <w:t>│   ├── client.py             # Reused</w:t>
+      </w:r>
+    </w:p>
+    <w:p>
+      <w:pPr>
+        <w:rPr>
+          <w:u w:val="none"/>
+        </w:rPr>
+      </w:pPr>
+      <w:r>
+        <w:rPr>
+          <w:u w:val="none"/>
+        </w:rPr>
+        <w:t>│   ├── aggregator.py         # Reused (Aegis logic)</w:t>
+      </w:r>
+    </w:p>
+    <w:p>
+      <w:pPr>
+        <w:rPr>
+          <w:u w:val="none"/>
+        </w:rPr>
+      </w:pPr>
+      <w:r>
+        <w:rPr>
+          <w:u w:val="none"/>
+        </w:rPr>
+        <w:t>│   └── ...</w:t>
+      </w:r>
+    </w:p>
+    <w:p>
+      <w:pPr>
+        <w:rPr>
+          <w:u w:val="none"/>
+        </w:rPr>
+      </w:pPr>
+      <w:r>
+        <w:rPr>
+          <w:u w:val="none"/>
+        </w:rPr>
+        <w:t>│</w:t>
+      </w:r>
+    </w:p>
+    <w:p>
+      <w:pPr>
+        <w:rPr>
+          <w:u w:val="none"/>
+        </w:rPr>
+      </w:pPr>
+      <w:r>
+        <w:rPr>
+          <w:u w:val="none"/>
+        </w:rPr>
+        <w:t xml:space="preserve">└── </w:t>
+      </w:r>
+      <w:proofErr w:type="spellStart"/>
+      <w:r>
+        <w:rPr>
+          <w:u w:val="none"/>
+        </w:rPr>
+        <w:t>OperationSentinel</w:t>
+      </w:r>
+      <w:proofErr w:type="spellEnd"/>
+      <w:r>
+        <w:rPr>
+          <w:u w:val="none"/>
+        </w:rPr>
+        <w:t>/        # &lt;--- NEW APPLICATION</w:t>
+      </w:r>
+    </w:p>
+    <w:p>
+      <w:pPr>
+        <w:rPr>
+          <w:u w:val="none"/>
+        </w:rPr>
+      </w:pPr>
+      <w:r>
+        <w:rPr>
+          <w:u w:val="none"/>
+        </w:rPr>
+        <w:t xml:space="preserve">    ├── sentinel_demo.py      # The new "Interactive" runner</w:t>
+      </w:r>
+    </w:p>
+    <w:p>
+      <w:pPr>
+        <w:rPr>
+          <w:u w:val="none"/>
+        </w:rPr>
+      </w:pPr>
+      <w:r>
+        <w:rPr>
+          <w:u w:val="none"/>
+        </w:rPr>
+        <w:t xml:space="preserve">    ├── sentinel_config.py    # Specific settings (20 drones, etc.)</w:t>
+      </w:r>
+    </w:p>
+    <w:p>
+      <w:pPr>
+        <w:rPr>
+          <w:u w:val="none"/>
+        </w:rPr>
+      </w:pPr>
+      <w:r>
+        <w:rPr>
+          <w:u w:val="none"/>
+        </w:rPr>
+        <w:lastRenderedPageBreak/>
+        <w:t xml:space="preserve">    └── assets/               # Demo-specific logs or UI assets</w:t>
+      </w:r>
+    </w:p>
+    <w:p>
+      <w:pPr>
+        <w:rPr>
+          <w:b/>
+          <w:u w:val="none"/>
+        </w:rPr>
+      </w:pPr>
+      <w:r>
+        <w:rPr>
+          <w:b/>
+          <w:u w:val="none"/>
+        </w:rPr>
+        <w:t>4. Required Modifications (Minimal)</w:t>
+      </w:r>
+    </w:p>
+    <w:p>
+      <w:pPr>
+        <w:rPr>
+          <w:u w:val="none"/>
+        </w:rPr>
+      </w:pPr>
+      <w:r>
+        <w:rPr>
+          <w:u w:val="none"/>
+        </w:rPr>
+        <w:t>To make the "Demo Flow" work seamlessly, we will need to make 2 small changes to your </w:t>
+      </w:r>
+      <w:r>
+        <w:rPr>
+          <w:i/>
+          <w:iCs/>
+          <w:u w:val="none"/>
+        </w:rPr>
+        <w:t>existing</w:t>
+      </w:r>
+      <w:r>
+        <w:rPr>
+          <w:u w:val="none"/>
+        </w:rPr>
+        <w:t> </w:t>
+      </w:r>
+    </w:p>
+    <w:p>
+      <w:pPr>
+        <w:rPr>
+          <w:u w:val="none"/>
+        </w:rPr>
+      </w:pPr>
+      <w:proofErr w:type="spellStart"/>
+      <w:r>
+        <w:rPr>
+          <w:u w:val="none"/>
+        </w:rPr>
+        <w:t>FL_Project</w:t>
+      </w:r>
+      <w:proofErr w:type="spellEnd"/>
+    </w:p>
+    <w:p>
+      <w:pPr>
+        <w:rPr>
+          <w:u w:val="none"/>
+        </w:rPr>
+      </w:pPr>
+      <w:r>
+        <w:rPr>
+          <w:u w:val="none"/>
+        </w:rPr>
+        <w:t> files (when you are ready):</w:t>
+      </w:r>
+    </w:p>
+    <w:p>
+      <w:pPr>
+        <w:numPr>
+          <w:ilvl w:val="0"/>
+          <w:numId w:val="13"/>
+        </w:numPr>
+        <w:rPr>
+          <w:u w:val="none"/>
+        </w:rPr>
+      </w:pPr>
+      <w:r>
+        <w:rPr>
+          <w:b/>
+          <w:u w:val="none"/>
+        </w:rPr>
+        <w:t>Phase 2 Support (Specific Targeting):</w:t>
+      </w:r>
+    </w:p>
+    <w:p>
+      <w:pPr>
+        <w:numPr>
+          <w:ilvl w:val="1"/>
+          <w:numId w:val="13"/>
+        </w:numPr>
+        <w:rPr>
+          <w:u w:val="none"/>
+        </w:rPr>
+      </w:pPr>
+      <w:r>
+        <w:rPr>
+          <w:i/>
+          <w:iCs/>
+          <w:u w:val="none"/>
+        </w:rPr>
+        <w:t>Current State:</w:t>
+      </w:r>
+      <w:r>
+        <w:rPr>
+          <w:u w:val="none"/>
+        </w:rPr>
+        <w:t> </w:t>
+      </w:r>
+    </w:p>
+    <w:p>
+      <w:pPr>
+        <w:rPr>
+          <w:u w:val="none"/>
+        </w:rPr>
+      </w:pPr>
+      <w:r>
+        <w:rPr>
+          <w:u w:val="none"/>
+        </w:rPr>
+        <w:t>server.py selects attackers </w:t>
+      </w:r>
+      <w:r>
+        <w:rPr>
+          <w:i/>
+          <w:iCs/>
+          <w:u w:val="none"/>
+        </w:rPr>
+        <w:t>randomly</w:t>
+      </w:r>
+      <w:r>
+        <w:rPr>
+          <w:u w:val="none"/>
+        </w:rPr>
+        <w:t> (</w:t>
+      </w:r>
+    </w:p>
+    <w:p>
+      <w:pPr>
+        <w:rPr>
+          <w:u w:val="none"/>
+        </w:rPr>
+      </w:pPr>
+      <w:proofErr w:type="spellStart"/>
+      <w:r>
+        <w:rPr>
+          <w:u w:val="none"/>
+        </w:rPr>
+        <w:t>random.sample</w:t>
+      </w:r>
+      <w:proofErr w:type="spellEnd"/>
+    </w:p>
+    <w:p>
+      <w:pPr>
+        <w:rPr>
+          <w:u w:val="none"/>
+        </w:rPr>
+      </w:pPr>
+      <w:r>
+        <w:rPr>
+          <w:u w:val="none"/>
+        </w:rPr>
+        <w:t>).</w:t>
+      </w:r>
+    </w:p>
+    <w:p>
+      <w:pPr>
+        <w:numPr>
+          <w:ilvl w:val="1"/>
+          <w:numId w:val="13"/>
+        </w:numPr>
+        <w:rPr>
+          <w:u w:val="none"/>
+        </w:rPr>
+      </w:pPr>
+      <w:r>
+        <w:rPr>
+          <w:i/>
+          <w:iCs/>
+          <w:u w:val="none"/>
+        </w:rPr>
+        <w:t>Required Change:</w:t>
+      </w:r>
+      <w:r>
+        <w:rPr>
+          <w:u w:val="none"/>
+        </w:rPr>
+        <w:t> Update </w:t>
+      </w:r>
+    </w:p>
+    <w:p>
+      <w:pPr>
+        <w:rPr>
+          <w:u w:val="none"/>
+        </w:rPr>
+      </w:pPr>
+      <w:proofErr w:type="spellStart"/>
+      <w:r>
+        <w:rPr>
+          <w:u w:val="none"/>
+        </w:rPr>
+        <w:t>run_round</w:t>
+      </w:r>
+      <w:proofErr w:type="spellEnd"/>
+      <w:r>
+        <w:rPr>
+          <w:u w:val="none"/>
+        </w:rPr>
+        <w:t> to accept a </w:t>
+      </w:r>
+    </w:p>
+    <w:p>
+      <w:pPr>
+        <w:rPr>
+          <w:u w:val="none"/>
+        </w:rPr>
+      </w:pPr>
+      <w:proofErr w:type="spellStart"/>
+      <w:r>
+        <w:rPr>
+          <w:u w:val="none"/>
+        </w:rPr>
+        <w:t>specific_attackers</w:t>
+      </w:r>
+      <w:proofErr w:type="spellEnd"/>
+    </w:p>
+    <w:p>
+      <w:pPr>
+        <w:rPr>
+          <w:u w:val="none"/>
+        </w:rPr>
+      </w:pPr>
+      <w:r>
+        <w:rPr>
+          <w:u w:val="none"/>
+        </w:rPr>
+        <w:t> list (e.g., </w:t>
+      </w:r>
+    </w:p>
+    <w:p>
+      <w:pPr>
+        <w:rPr>
+          <w:u w:val="none"/>
+        </w:rPr>
+      </w:pPr>
+      <w:r>
+        <w:rPr>
+          <w:u w:val="none"/>
+        </w:rPr>
+        <w:t>[Drone_3]</w:t>
+      </w:r>
+    </w:p>
+    <w:p>
+      <w:pPr>
+        <w:rPr>
+          <w:u w:val="none"/>
+        </w:rPr>
+      </w:pPr>
+      <w:r>
+        <w:rPr>
+          <w:u w:val="none"/>
+        </w:rPr>
+        <w:t xml:space="preserve">) </w:t>
+      </w:r>
+      <w:proofErr w:type="gramStart"/>
+      <w:r>
+        <w:rPr>
+          <w:u w:val="none"/>
+        </w:rPr>
+        <w:t>so</w:t>
+      </w:r>
+      <w:proofErr w:type="gramEnd"/>
+      <w:r>
+        <w:rPr>
+          <w:u w:val="none"/>
+        </w:rPr>
+        <w:t xml:space="preserve"> you can target a specific drone.</w:t>
+      </w:r>
+    </w:p>
+    <w:p>
+      <w:pPr>
+        <w:numPr>
+          <w:ilvl w:val="0"/>
+          <w:numId w:val="13"/>
+        </w:numPr>
+        <w:rPr>
+          <w:u w:val="none"/>
+        </w:rPr>
+      </w:pPr>
+      <w:r>
+        <w:rPr>
+          <w:b/>
+          <w:u w:val="none"/>
+        </w:rPr>
+        <w:t>Phase 3 Support (Protocol Switching):</w:t>
+      </w:r>
+    </w:p>
+    <w:p>
+      <w:pPr>
+        <w:numPr>
+          <w:ilvl w:val="1"/>
+          <w:numId w:val="13"/>
+        </w:numPr>
+        <w:rPr>
+          <w:u w:val="none"/>
+        </w:rPr>
+      </w:pPr>
+      <w:r>
+        <w:rPr>
+          <w:i/>
+          <w:iCs/>
+          <w:u w:val="none"/>
+        </w:rPr>
+        <w:t>Current State:</w:t>
+      </w:r>
+      <w:r>
+        <w:rPr>
+          <w:u w:val="none"/>
+        </w:rPr>
+        <w:t> The aggregator (</w:t>
+      </w:r>
+      <w:proofErr w:type="spellStart"/>
+      <w:r>
+        <w:rPr>
+          <w:u w:val="none"/>
+        </w:rPr>
+        <w:t>FedAvg</w:t>
+      </w:r>
+      <w:proofErr w:type="spellEnd"/>
+      <w:r>
+        <w:rPr>
+          <w:u w:val="none"/>
+        </w:rPr>
+        <w:t>) is fixed when </w:t>
+      </w:r>
+    </w:p>
+    <w:p>
+      <w:pPr>
+        <w:rPr>
+          <w:u w:val="none"/>
+        </w:rPr>
+      </w:pPr>
+      <w:r>
+        <w:rPr>
+          <w:u w:val="none"/>
+        </w:rPr>
+        <w:t>Server is initialized.</w:t>
+      </w:r>
+    </w:p>
+    <w:p>
+      <w:pPr>
+        <w:numPr>
+          <w:ilvl w:val="1"/>
+          <w:numId w:val="13"/>
+        </w:numPr>
+        <w:rPr>
+          <w:u w:val="none"/>
+        </w:rPr>
+      </w:pPr>
+      <w:r>
+        <w:rPr>
+          <w:i/>
+          <w:iCs/>
+          <w:u w:val="none"/>
+        </w:rPr>
+        <w:t>Required Change:</w:t>
+      </w:r>
+      <w:r>
+        <w:rPr>
+          <w:u w:val="none"/>
+        </w:rPr>
+        <w:t> Allow changing </w:t>
+      </w:r>
+    </w:p>
+    <w:p>
+      <w:pPr>
+        <w:rPr>
+          <w:u w:val="none"/>
+        </w:rPr>
+      </w:pPr>
+      <w:proofErr w:type="spellStart"/>
+      <w:proofErr w:type="gramStart"/>
+      <w:r>
+        <w:rPr>
+          <w:u w:val="none"/>
+        </w:rPr>
+        <w:t>server.aggregator</w:t>
+      </w:r>
+      <w:proofErr w:type="gramEnd"/>
+      <w:r>
+        <w:rPr>
+          <w:u w:val="none"/>
+        </w:rPr>
+        <w:t>_func</w:t>
+      </w:r>
+      <w:proofErr w:type="spellEnd"/>
+    </w:p>
+    <w:p>
+      <w:pPr>
+        <w:rPr>
+          <w:u w:val="none"/>
+        </w:rPr>
+      </w:pPr>
+      <w:r>
+        <w:rPr>
+          <w:u w:val="none"/>
+        </w:rPr>
+        <w:t> dynamically at runtime (Python allows this natively, so no big code change, just a logic change in the runner).</w:t>
+      </w:r>
+    </w:p>
+    <w:p>
+      <w:pPr>
+        <w:rPr>
+          <w:b/>
+          <w:u w:val="none"/>
+        </w:rPr>
+      </w:pPr>
+      <w:r>
+        <w:rPr>
+          <w:b/>
+          <w:u w:val="none"/>
+        </w:rPr>
+        <w:t>5. Next Steps</w:t>
+      </w:r>
+    </w:p>
+    <w:p>
+      <w:pPr>
+        <w:rPr>
+          <w:u w:val="none"/>
+        </w:rPr>
+      </w:pPr>
+      <w:r>
+        <w:rPr>
+          <w:u w:val="none"/>
+        </w:rPr>
+        <w:t>If you approve, I can trigger the setup for the new directory.</w:t>
+      </w:r>
+    </w:p>
+    <w:p>
+      <w:pPr>
+        <w:rPr>
+          <w:u w:val="none"/>
+        </w:rPr>
+      </w:pPr>
+      <w:r>
+        <w:rPr>
+          <w:b/>
+          <w:u w:val="none"/>
+        </w:rPr>
+        <w:t>Plan:</w:t>
+      </w:r>
+    </w:p>
+    <w:p>
+      <w:pPr>
+        <w:numPr>
+          <w:ilvl w:val="0"/>
+          <w:numId w:val="14"/>
+        </w:numPr>
+        <w:rPr>
+          <w:u w:val="none"/>
+        </w:rPr>
+      </w:pPr>
+      <w:r>
+        <w:rPr>
+          <w:u w:val="none"/>
+        </w:rPr>
+        <w:t>Create the </w:t>
+      </w:r>
+    </w:p>
+    <w:p>
+      <w:pPr>
+        <w:rPr>
+          <w:u w:val="none"/>
+        </w:rPr>
+      </w:pPr>
+      <w:proofErr w:type="spellStart"/>
+      <w:r>
+        <w:rPr>
+          <w:u w:val="none"/>
+        </w:rPr>
+        <w:t>OperationSentinel</w:t>
+      </w:r>
+      <w:proofErr w:type="spellEnd"/>
+    </w:p>
+    <w:p>
+      <w:pPr>
+        <w:rPr>
+          <w:u w:val="none"/>
+        </w:rPr>
+      </w:pPr>
+      <w:r>
+        <w:rPr>
+          <w:u w:val="none"/>
+        </w:rPr>
+        <w:t> folder.</w:t>
+      </w:r>
+    </w:p>
+    <w:p>
+      <w:pPr>
+        <w:numPr>
+          <w:ilvl w:val="0"/>
+          <w:numId w:val="14"/>
+        </w:numPr>
+        <w:rPr>
+          <w:u w:val="none"/>
+        </w:rPr>
+      </w:pPr>
+      <w:r>
+        <w:rPr>
+          <w:u w:val="none"/>
+        </w:rPr>
+        <w:t>Create </w:t>
+      </w:r>
+    </w:p>
+    <w:p>
+      <w:pPr>
+        <w:rPr>
+          <w:u w:val="none"/>
+        </w:rPr>
+      </w:pPr>
+      <w:r>
+        <w:rPr>
+          <w:u w:val="none"/>
+        </w:rPr>
+        <w:lastRenderedPageBreak/>
+        <w:t>sentinel_demo.py</w:t>
+      </w:r>
+    </w:p>
+    <w:p>
+      <w:pPr>
+        <w:rPr>
+          <w:u w:val="none"/>
+        </w:rPr>
+      </w:pPr>
+      <w:r>
+        <w:rPr>
+          <w:u w:val="none"/>
+        </w:rPr>
+        <w:t> which adds </w:t>
+      </w:r>
+    </w:p>
+    <w:p>
+      <w:pPr>
+        <w:rPr>
+          <w:u w:val="none"/>
+        </w:rPr>
+      </w:pPr>
+      <w:proofErr w:type="gramStart"/>
+      <w:r>
+        <w:rPr>
+          <w:u w:val="none"/>
+        </w:rPr>
+        <w:t>..</w:t>
+      </w:r>
+      <w:proofErr w:type="gramEnd"/>
+      <w:r>
+        <w:rPr>
+          <w:u w:val="none"/>
+        </w:rPr>
+        <w:t>/</w:t>
+      </w:r>
+      <w:proofErr w:type="spellStart"/>
+      <w:r>
+        <w:rPr>
+          <w:u w:val="none"/>
+        </w:rPr>
+        <w:t>FL_Project</w:t>
+      </w:r>
+      <w:proofErr w:type="spellEnd"/>
+    </w:p>
+    <w:p>
+      <w:pPr>
+        <w:rPr>
+          <w:u w:val="none"/>
+        </w:rPr>
+      </w:pPr>
+      <w:r>
+        <w:rPr>
+          <w:u w:val="none"/>
+        </w:rPr>
+        <w:t> to the system path to import your core classes.</w:t>
+      </w:r>
+    </w:p>
+    <w:p>
+      <w:pPr>
+        <w:numPr>
+          <w:ilvl w:val="0"/>
+          <w:numId w:val="14"/>
+        </w:numPr>
+        <w:rPr>
+          <w:u w:val="none"/>
+        </w:rPr>
+      </w:pPr>
+      <w:r>
+        <w:rPr>
+          <w:u w:val="none"/>
+        </w:rPr>
+        <w:t>Draft the "Phase 1 / 2 / 3" interaction loop in </w:t>
+      </w:r>
+    </w:p>
+    <w:p>
+      <w:pPr>
+        <w:rPr>
+          <w:u w:val="none"/>
+        </w:rPr>
+      </w:pPr>
+      <w:r>
+        <w:rPr>
+          <w:u w:val="none"/>
+        </w:rPr>
+        <w:t>sentinel_demo.py</w:t>
+      </w:r>
+    </w:p>
+    <w:p>
+      <w:pPr>
+        <w:rPr>
+          <w:u w:val="none"/>
+        </w:rPr>
+      </w:pPr>
+      <w:r>
+        <w:rPr>
+          <w:u w:val="none"/>
+        </w:rPr>
+        <w:t>.</w:t>
       </w:r>
     </w:p>
     <w:p>
@@ -2384,6 +4077,119 @@
     </w:lvl>
   </w:abstractNum>
   <w:abstractNum w:abstractNumId="3" w15:restartNumberingAfterBreak="0">
+    <w:nsid w:val="1B302D26"/>
+    <w:multiLevelType w:val="multilevel"/>
+    <w:tmpl w:val="6B4A7324"/>
+    <w:lvl w:ilvl="0">
+      <w:start w:val="1"/>
+      <w:numFmt w:val="decimal"/>
+      <w:lvlText w:val="%1."/>
+      <w:lvlJc w:val="left"/>
+      <w:pPr>
+        <w:tabs>
+          <w:tab w:val="num" w:pos="720"/>
+        </w:tabs>
+        <w:ind w:left="720" w:hanging="360"/>
+      </w:pPr>
+    </w:lvl>
+    <w:lvl w:ilvl="1" w:tentative="1">
+      <w:start w:val="1"/>
+      <w:numFmt w:val="decimal"/>
+      <w:lvlText w:val="%2."/>
+      <w:lvlJc w:val="left"/>
+      <w:pPr>
+        <w:tabs>
+          <w:tab w:val="num" w:pos="1440"/>
+        </w:tabs>
+        <w:ind w:left="1440" w:hanging="360"/>
+      </w:pPr>
+    </w:lvl>
+    <w:lvl w:ilvl="2" w:tentative="1">
+      <w:start w:val="1"/>
+      <w:numFmt w:val="decimal"/>
+      <w:lvlText w:val="%3."/>
+      <w:lvlJc w:val="left"/>
+      <w:pPr>
+        <w:tabs>
+          <w:tab w:val="num" w:pos="2160"/>
+        </w:tabs>
+        <w:ind w:left="2160" w:hanging="360"/>
+      </w:pPr>
+    </w:lvl>
+    <w:lvl w:ilvl="3" w:tentative="1">
+      <w:start w:val="1"/>
+      <w:numFmt w:val="decimal"/>
+      <w:lvlText w:val="%4."/>
+      <w:lvlJc w:val="left"/>
+      <w:pPr>
+        <w:tabs>
+          <w:tab w:val="num" w:pos="2880"/>
+        </w:tabs>
+        <w:ind w:left="2880" w:hanging="360"/>
+      </w:pPr>
+    </w:lvl>
+    <w:lvl w:ilvl="4" w:tentative="1">
+      <w:start w:val="1"/>
+      <w:numFmt w:val="decimal"/>
+      <w:lvlText w:val="%5."/>
+      <w:lvlJc w:val="left"/>
+      <w:pPr>
+        <w:tabs>
+          <w:tab w:val="num" w:pos="3600"/>
+        </w:tabs>
+        <w:ind w:left="3600" w:hanging="360"/>
+      </w:pPr>
+    </w:lvl>
+    <w:lvl w:ilvl="5" w:tentative="1">
+      <w:start w:val="1"/>
+      <w:numFmt w:val="decimal"/>
+      <w:lvlText w:val="%6."/>
+      <w:lvlJc w:val="left"/>
+      <w:pPr>
+        <w:tabs>
+          <w:tab w:val="num" w:pos="4320"/>
+        </w:tabs>
+        <w:ind w:left="4320" w:hanging="360"/>
+      </w:pPr>
+    </w:lvl>
+    <w:lvl w:ilvl="6" w:tentative="1">
+      <w:start w:val="1"/>
+      <w:numFmt w:val="decimal"/>
+      <w:lvlText w:val="%7."/>
+      <w:lvlJc w:val="left"/>
+      <w:pPr>
+        <w:tabs>
+          <w:tab w:val="num" w:pos="5040"/>
+        </w:tabs>
+        <w:ind w:left="5040" w:hanging="360"/>
+      </w:pPr>
+    </w:lvl>
+    <w:lvl w:ilvl="7" w:tentative="1">
+      <w:start w:val="1"/>
+      <w:numFmt w:val="decimal"/>
+      <w:lvlText w:val="%8."/>
+      <w:lvlJc w:val="left"/>
+      <w:pPr>
+        <w:tabs>
+          <w:tab w:val="num" w:pos="5760"/>
+        </w:tabs>
+        <w:ind w:left="5760" w:hanging="360"/>
+      </w:pPr>
+    </w:lvl>
+    <w:lvl w:ilvl="8" w:tentative="1">
+      <w:start w:val="1"/>
+      <w:numFmt w:val="decimal"/>
+      <w:lvlText w:val="%9."/>
+      <w:lvlJc w:val="left"/>
+      <w:pPr>
+        <w:tabs>
+          <w:tab w:val="num" w:pos="6480"/>
+        </w:tabs>
+        <w:ind w:left="6480" w:hanging="360"/>
+      </w:pPr>
+    </w:lvl>
+  </w:abstractNum>
+  <w:abstractNum w:abstractNumId="4" w15:restartNumberingAfterBreak="0">
     <w:nsid w:val="1DD242E3"/>
     <w:multiLevelType w:val="multilevel"/>
     <w:tmpl w:val="7E8E9D38"/>
@@ -2496,7 +4302,273 @@
       </w:pPr>
     </w:lvl>
   </w:abstractNum>
-  <w:abstractNum w:abstractNumId="4" w15:restartNumberingAfterBreak="0">
+  <w:abstractNum w:abstractNumId="5" w15:restartNumberingAfterBreak="0">
+    <w:nsid w:val="247A2410"/>
+    <w:multiLevelType w:val="multilevel"/>
+    <w:tmpl w:val="66F09178"/>
+    <w:lvl w:ilvl="0">
+      <w:start w:val="1"/>
+      <w:numFmt w:val="decimal"/>
+      <w:lvlText w:val="%1."/>
+      <w:lvlJc w:val="left"/>
+      <w:pPr>
+        <w:tabs>
+          <w:tab w:val="num" w:pos="720"/>
+        </w:tabs>
+        <w:ind w:left="720" w:hanging="360"/>
+      </w:pPr>
+    </w:lvl>
+    <w:lvl w:ilvl="1">
+      <w:start w:val="1"/>
+      <w:numFmt w:val="bullet"/>
+      <w:lvlText w:val=""/>
+      <w:lvlJc w:val="left"/>
+      <w:pPr>
+        <w:tabs>
+          <w:tab w:val="num" w:pos="1440"/>
+        </w:tabs>
+        <w:ind w:left="1440" w:hanging="360"/>
+      </w:pPr>
+      <w:rPr>
+        <w:rFonts w:ascii="Symbol" w:hAnsi="Symbol" w:hint="default"/>
+        <w:sz w:val="20"/>
+      </w:rPr>
+    </w:lvl>
+    <w:lvl w:ilvl="2" w:tentative="1">
+      <w:start w:val="1"/>
+      <w:numFmt w:val="decimal"/>
+      <w:lvlText w:val="%3."/>
+      <w:lvlJc w:val="left"/>
+      <w:pPr>
+        <w:tabs>
+          <w:tab w:val="num" w:pos="2160"/>
+        </w:tabs>
+        <w:ind w:left="2160" w:hanging="360"/>
+      </w:pPr>
+    </w:lvl>
+    <w:lvl w:ilvl="3" w:tentative="1">
+      <w:start w:val="1"/>
+      <w:numFmt w:val="decimal"/>
+      <w:lvlText w:val="%4."/>
+      <w:lvlJc w:val="left"/>
+      <w:pPr>
+        <w:tabs>
+          <w:tab w:val="num" w:pos="2880"/>
+        </w:tabs>
+        <w:ind w:left="2880" w:hanging="360"/>
+      </w:pPr>
+    </w:lvl>
+    <w:lvl w:ilvl="4" w:tentative="1">
+      <w:start w:val="1"/>
+      <w:numFmt w:val="decimal"/>
+      <w:lvlText w:val="%5."/>
+      <w:lvlJc w:val="left"/>
+      <w:pPr>
+        <w:tabs>
+          <w:tab w:val="num" w:pos="3600"/>
+        </w:tabs>
+        <w:ind w:left="3600" w:hanging="360"/>
+      </w:pPr>
+    </w:lvl>
+    <w:lvl w:ilvl="5" w:tentative="1">
+      <w:start w:val="1"/>
+      <w:numFmt w:val="decimal"/>
+      <w:lvlText w:val="%6."/>
+      <w:lvlJc w:val="left"/>
+      <w:pPr>
+        <w:tabs>
+          <w:tab w:val="num" w:pos="4320"/>
+        </w:tabs>
+        <w:ind w:left="4320" w:hanging="360"/>
+      </w:pPr>
+    </w:lvl>
+    <w:lvl w:ilvl="6" w:tentative="1">
+      <w:start w:val="1"/>
+      <w:numFmt w:val="decimal"/>
+      <w:lvlText w:val="%7."/>
+      <w:lvlJc w:val="left"/>
+      <w:pPr>
+        <w:tabs>
+          <w:tab w:val="num" w:pos="5040"/>
+        </w:tabs>
+        <w:ind w:left="5040" w:hanging="360"/>
+      </w:pPr>
+    </w:lvl>
+    <w:lvl w:ilvl="7" w:tentative="1">
+      <w:start w:val="1"/>
+      <w:numFmt w:val="decimal"/>
+      <w:lvlText w:val="%8."/>
+      <w:lvlJc w:val="left"/>
+      <w:pPr>
+        <w:tabs>
+          <w:tab w:val="num" w:pos="5760"/>
+        </w:tabs>
+        <w:ind w:left="5760" w:hanging="360"/>
+      </w:pPr>
+    </w:lvl>
+    <w:lvl w:ilvl="8" w:tentative="1">
+      <w:start w:val="1"/>
+      <w:numFmt w:val="decimal"/>
+      <w:lvlText w:val="%9."/>
+      <w:lvlJc w:val="left"/>
+      <w:pPr>
+        <w:tabs>
+          <w:tab w:val="num" w:pos="6480"/>
+        </w:tabs>
+        <w:ind w:left="6480" w:hanging="360"/>
+      </w:pPr>
+    </w:lvl>
+  </w:abstractNum>
+  <w:abstractNum w:abstractNumId="6" w15:restartNumberingAfterBreak="0">
+    <w:nsid w:val="290300E6"/>
+    <w:multiLevelType w:val="multilevel"/>
+    <w:tmpl w:val="4170E0A0"/>
+    <w:lvl w:ilvl="0">
+      <w:start w:val="1"/>
+      <w:numFmt w:val="bullet"/>
+      <w:lvlText w:val=""/>
+      <w:lvlJc w:val="left"/>
+      <w:pPr>
+        <w:tabs>
+          <w:tab w:val="num" w:pos="720"/>
+        </w:tabs>
+        <w:ind w:left="720" w:hanging="360"/>
+      </w:pPr>
+      <w:rPr>
+        <w:rFonts w:ascii="Symbol" w:hAnsi="Symbol" w:hint="default"/>
+        <w:sz w:val="20"/>
+      </w:rPr>
+    </w:lvl>
+    <w:lvl w:ilvl="1" w:tentative="1">
+      <w:start w:val="1"/>
+      <w:numFmt w:val="bullet"/>
+      <w:lvlText w:val=""/>
+      <w:lvlJc w:val="left"/>
+      <w:pPr>
+        <w:tabs>
+          <w:tab w:val="num" w:pos="1440"/>
+        </w:tabs>
+        <w:ind w:left="1440" w:hanging="360"/>
+      </w:pPr>
+      <w:rPr>
+        <w:rFonts w:ascii="Symbol" w:hAnsi="Symbol" w:hint="default"/>
+        <w:sz w:val="20"/>
+      </w:rPr>
+    </w:lvl>
+    <w:lvl w:ilvl="2" w:tentative="1">
+      <w:start w:val="1"/>
+      <w:numFmt w:val="bullet"/>
+      <w:lvlText w:val=""/>
+      <w:lvlJc w:val="left"/>
+      <w:pPr>
+        <w:tabs>
+          <w:tab w:val="num" w:pos="2160"/>
+        </w:tabs>
+        <w:ind w:left="2160" w:hanging="360"/>
+      </w:pPr>
+      <w:rPr>
+        <w:rFonts w:ascii="Symbol" w:hAnsi="Symbol" w:hint="default"/>
+        <w:sz w:val="20"/>
+      </w:rPr>
+    </w:lvl>
+    <w:lvl w:ilvl="3" w:tentative="1">
+      <w:start w:val="1"/>
+      <w:numFmt w:val="bullet"/>
+      <w:lvlText w:val=""/>
+      <w:lvlJc w:val="left"/>
+      <w:pPr>
+        <w:tabs>
+          <w:tab w:val="num" w:pos="2880"/>
+        </w:tabs>
+        <w:ind w:left="2880" w:hanging="360"/>
+      </w:pPr>
+      <w:rPr>
+        <w:rFonts w:ascii="Symbol" w:hAnsi="Symbol" w:hint="default"/>
+        <w:sz w:val="20"/>
+      </w:rPr>
+    </w:lvl>
+    <w:lvl w:ilvl="4" w:tentative="1">
+      <w:start w:val="1"/>
+      <w:numFmt w:val="bullet"/>
+      <w:lvlText w:val=""/>
+      <w:lvlJc w:val="left"/>
+      <w:pPr>
+        <w:tabs>
+          <w:tab w:val="num" w:pos="3600"/>
+        </w:tabs>
+        <w:ind w:left="3600" w:hanging="360"/>
+      </w:pPr>
+      <w:rPr>
+        <w:rFonts w:ascii="Symbol" w:hAnsi="Symbol" w:hint="default"/>
+        <w:sz w:val="20"/>
+      </w:rPr>
+    </w:lvl>
+    <w:lvl w:ilvl="5" w:tentative="1">
+      <w:start w:val="1"/>
+      <w:numFmt w:val="bullet"/>
+      <w:lvlText w:val=""/>
+      <w:lvlJc w:val="left"/>
+      <w:pPr>
+        <w:tabs>
+          <w:tab w:val="num" w:pos="4320"/>
+        </w:tabs>
+        <w:ind w:left="4320" w:hanging="360"/>
+      </w:pPr>
+      <w:rPr>
+        <w:rFonts w:ascii="Symbol" w:hAnsi="Symbol" w:hint="default"/>
+        <w:sz w:val="20"/>
+      </w:rPr>
+    </w:lvl>
+    <w:lvl w:ilvl="6" w:tentative="1">
+      <w:start w:val="1"/>
+      <w:numFmt w:val="bullet"/>
+      <w:lvlText w:val=""/>
+      <w:lvlJc w:val="left"/>
+      <w:pPr>
+        <w:tabs>
+          <w:tab w:val="num" w:pos="5040"/>
+        </w:tabs>
+        <w:ind w:left="5040" w:hanging="360"/>
+      </w:pPr>
+      <w:rPr>
+        <w:rFonts w:ascii="Symbol" w:hAnsi="Symbol" w:hint="default"/>
+        <w:sz w:val="20"/>
+      </w:rPr>
+    </w:lvl>
+    <w:lvl w:ilvl="7" w:tentative="1">
+      <w:start w:val="1"/>
+      <w:numFmt w:val="bullet"/>
+      <w:lvlText w:val=""/>
+      <w:lvlJc w:val="left"/>
+      <w:pPr>
+        <w:tabs>
+          <w:tab w:val="num" w:pos="5760"/>
+        </w:tabs>
+        <w:ind w:left="5760" w:hanging="360"/>
+      </w:pPr>
+      <w:rPr>
+        <w:rFonts w:ascii="Symbol" w:hAnsi="Symbol" w:hint="default"/>
+        <w:sz w:val="20"/>
+      </w:rPr>
+    </w:lvl>
+    <w:lvl w:ilvl="8" w:tentative="1">
+      <w:start w:val="1"/>
+      <w:numFmt w:val="bullet"/>
+      <w:lvlText w:val=""/>
+      <w:lvlJc w:val="left"/>
+      <w:pPr>
+        <w:tabs>
+          <w:tab w:val="num" w:pos="6480"/>
+        </w:tabs>
+        <w:ind w:left="6480" w:hanging="360"/>
+      </w:pPr>
+      <w:rPr>
+        <w:rFonts w:ascii="Symbol" w:hAnsi="Symbol" w:hint="default"/>
+        <w:sz w:val="20"/>
+      </w:rPr>
+    </w:lvl>
+  </w:abstractNum>
+  <w:abstractNum w:abstractNumId="7" w15:restartNumberingAfterBreak="0">
     <w:nsid w:val="37DE6FE0"/>
     <w:multiLevelType w:val="multilevel"/>
     <w:tmpl w:val="73F04950"/>
@@ -2645,7 +4717,7 @@
       </w:rPr>
     </w:lvl>
   </w:abstractNum>
-  <w:abstractNum w:abstractNumId="5" w15:restartNumberingAfterBreak="0">
+  <w:abstractNum w:abstractNumId="8" w15:restartNumberingAfterBreak="0">
     <w:nsid w:val="4AB2438C"/>
     <w:multiLevelType w:val="multilevel"/>
     <w:tmpl w:val="25AA5C48"/>
@@ -2762,7 +4834,7 @@
       </w:pPr>
     </w:lvl>
   </w:abstractNum>
-  <w:abstractNum w:abstractNumId="6" w15:restartNumberingAfterBreak="0">
+  <w:abstractNum w:abstractNumId="9" w15:restartNumberingAfterBreak="0">
     <w:nsid w:val="4DFF6784"/>
     <w:multiLevelType w:val="multilevel"/>
     <w:tmpl w:val="F1F25098"/>
@@ -2875,7 +4947,156 @@
       </w:pPr>
     </w:lvl>
   </w:abstractNum>
-  <w:abstractNum w:abstractNumId="7" w15:restartNumberingAfterBreak="0">
+  <w:abstractNum w:abstractNumId="10" w15:restartNumberingAfterBreak="0">
+    <w:nsid w:val="5F0D52E6"/>
+    <w:multiLevelType w:val="multilevel"/>
+    <w:tmpl w:val="372AC982"/>
+    <w:lvl w:ilvl="0">
+      <w:start w:val="1"/>
+      <w:numFmt w:val="bullet"/>
+      <w:lvlText w:val=""/>
+      <w:lvlJc w:val="left"/>
+      <w:pPr>
+        <w:tabs>
+          <w:tab w:val="num" w:pos="720"/>
+        </w:tabs>
+        <w:ind w:left="720" w:hanging="360"/>
+      </w:pPr>
+      <w:rPr>
+        <w:rFonts w:ascii="Symbol" w:hAnsi="Symbol" w:hint="default"/>
+        <w:sz w:val="20"/>
+      </w:rPr>
+    </w:lvl>
+    <w:lvl w:ilvl="1" w:tentative="1">
+      <w:start w:val="1"/>
+      <w:numFmt w:val="bullet"/>
+      <w:lvlText w:val=""/>
+      <w:lvlJc w:val="left"/>
+      <w:pPr>
+        <w:tabs>
+          <w:tab w:val="num" w:pos="1440"/>
+        </w:tabs>
+        <w:ind w:left="1440" w:hanging="360"/>
+      </w:pPr>
+      <w:rPr>
+        <w:rFonts w:ascii="Symbol" w:hAnsi="Symbol" w:hint="default"/>
+        <w:sz w:val="20"/>
+      </w:rPr>
+    </w:lvl>
+    <w:lvl w:ilvl="2" w:tentative="1">
+      <w:start w:val="1"/>
+      <w:numFmt w:val="bullet"/>
+      <w:lvlText w:val=""/>
+      <w:lvlJc w:val="left"/>
+      <w:pPr>
+        <w:tabs>
+          <w:tab w:val="num" w:pos="2160"/>
+        </w:tabs>
+        <w:ind w:left="2160" w:hanging="360"/>
+      </w:pPr>
+      <w:rPr>
+        <w:rFonts w:ascii="Symbol" w:hAnsi="Symbol" w:hint="default"/>
+        <w:sz w:val="20"/>
+      </w:rPr>
+    </w:lvl>
+    <w:lvl w:ilvl="3" w:tentative="1">
+      <w:start w:val="1"/>
+      <w:numFmt w:val="bullet"/>
+      <w:lvlText w:val=""/>
+      <w:lvlJc w:val="left"/>
+      <w:pPr>
+        <w:tabs>
+          <w:tab w:val="num" w:pos="2880"/>
+        </w:tabs>
+        <w:ind w:left="2880" w:hanging="360"/>
+      </w:pPr>
+      <w:rPr>
+        <w:rFonts w:ascii="Symbol" w:hAnsi="Symbol" w:hint="default"/>
+        <w:sz w:val="20"/>
+      </w:rPr>
+    </w:lvl>
+    <w:lvl w:ilvl="4" w:tentative="1">
+      <w:start w:val="1"/>
+      <w:numFmt w:val="bullet"/>
+      <w:lvlText w:val=""/>
+      <w:lvlJc w:val="left"/>
+      <w:pPr>
+        <w:tabs>
+          <w:tab w:val="num" w:pos="3600"/>
+        </w:tabs>
+        <w:ind w:left="3600" w:hanging="360"/>
+      </w:pPr>
+      <w:rPr>
+        <w:rFonts w:ascii="Symbol" w:hAnsi="Symbol" w:hint="default"/>
+        <w:sz w:val="20"/>
+      </w:rPr>
+    </w:lvl>
+    <w:lvl w:ilvl="5" w:tentative="1">
+      <w:start w:val="1"/>
+      <w:numFmt w:val="bullet"/>
+      <w:lvlText w:val=""/>
+      <w:lvlJc w:val="left"/>
+      <w:pPr>
+        <w:tabs>
+          <w:tab w:val="num" w:pos="4320"/>
+        </w:tabs>
+        <w:ind w:left="4320" w:hanging="360"/>
+      </w:pPr>
+      <w:rPr>
+        <w:rFonts w:ascii="Symbol" w:hAnsi="Symbol" w:hint="default"/>
+        <w:sz w:val="20"/>
+      </w:rPr>
+    </w:lvl>
+    <w:lvl w:ilvl="6" w:tentative="1">
+      <w:start w:val="1"/>
+      <w:numFmt w:val="bullet"/>
+      <w:lvlText w:val=""/>
+      <w:lvlJc w:val="left"/>
+      <w:pPr>
+        <w:tabs>
+          <w:tab w:val="num" w:pos="5040"/>
+        </w:tabs>
+        <w:ind w:left="5040" w:hanging="360"/>
+      </w:pPr>
+      <w:rPr>
+        <w:rFonts w:ascii="Symbol" w:hAnsi="Symbol" w:hint="default"/>
+        <w:sz w:val="20"/>
+      </w:rPr>
+    </w:lvl>
+    <w:lvl w:ilvl="7" w:tentative="1">
+      <w:start w:val="1"/>
+      <w:numFmt w:val="bullet"/>
+      <w:lvlText w:val=""/>
+      <w:lvlJc w:val="left"/>
+      <w:pPr>
+        <w:tabs>
+          <w:tab w:val="num" w:pos="5760"/>
+        </w:tabs>
+        <w:ind w:left="5760" w:hanging="360"/>
+      </w:pPr>
+      <w:rPr>
+        <w:rFonts w:ascii="Symbol" w:hAnsi="Symbol" w:hint="default"/>
+        <w:sz w:val="20"/>
+      </w:rPr>
+    </w:lvl>
+    <w:lvl w:ilvl="8" w:tentative="1">
+      <w:start w:val="1"/>
+      <w:numFmt w:val="bullet"/>
+      <w:lvlText w:val=""/>
+      <w:lvlJc w:val="left"/>
+      <w:pPr>
+        <w:tabs>
+          <w:tab w:val="num" w:pos="6480"/>
+        </w:tabs>
+        <w:ind w:left="6480" w:hanging="360"/>
+      </w:pPr>
+      <w:rPr>
+        <w:rFonts w:ascii="Symbol" w:hAnsi="Symbol" w:hint="default"/>
+        <w:sz w:val="20"/>
+      </w:rPr>
+    </w:lvl>
+  </w:abstractNum>
+  <w:abstractNum w:abstractNumId="11" w15:restartNumberingAfterBreak="0">
     <w:nsid w:val="60446516"/>
     <w:multiLevelType w:val="multilevel"/>
     <w:tmpl w:val="9C666428"/>
@@ -3024,7 +5245,7 @@
       </w:rPr>
     </w:lvl>
   </w:abstractNum>
-  <w:abstractNum w:abstractNumId="8" w15:restartNumberingAfterBreak="0">
+  <w:abstractNum w:abstractNumId="12" w15:restartNumberingAfterBreak="0">
     <w:nsid w:val="633E12C9"/>
     <w:multiLevelType w:val="multilevel"/>
     <w:tmpl w:val="DF507C44"/>
@@ -3173,7 +5394,7 @@
       </w:rPr>
     </w:lvl>
   </w:abstractNum>
-  <w:abstractNum w:abstractNumId="9" w15:restartNumberingAfterBreak="0">
+  <w:abstractNum w:abstractNumId="13" w15:restartNumberingAfterBreak="0">
     <w:nsid w:val="634E7D05"/>
     <w:multiLevelType w:val="multilevel"/>
     <w:tmpl w:val="F0686106"/>
@@ -3329,28 +5550,40 @@
     <w:abstractNumId w:val="0"/>
   </w:num>
   <w:num w:numId="3" w16cid:durableId="1690259185">
+    <w:abstractNumId w:val="12"/>
+  </w:num>
+  <w:num w:numId="4" w16cid:durableId="1753427185">
     <w:abstractNumId w:val="8"/>
   </w:num>
-  <w:num w:numId="4" w16cid:durableId="1753427185">
-    <w:abstractNumId w:val="5"/>
-  </w:num>
   <w:num w:numId="5" w16cid:durableId="922030651">
-    <w:abstractNumId w:val="6"/>
+    <w:abstractNumId w:val="9"/>
   </w:num>
   <w:num w:numId="6" w16cid:durableId="1951545790">
-    <w:abstractNumId w:val="3"/>
+    <w:abstractNumId w:val="4"/>
   </w:num>
   <w:num w:numId="7" w16cid:durableId="1632977609">
-    <w:abstractNumId w:val="7"/>
+    <w:abstractNumId w:val="11"/>
   </w:num>
   <w:num w:numId="8" w16cid:durableId="1603107879">
-    <w:abstractNumId w:val="9"/>
+    <w:abstractNumId w:val="13"/>
   </w:num>
   <w:num w:numId="9" w16cid:durableId="1920284598">
-    <w:abstractNumId w:val="4"/>
+    <w:abstractNumId w:val="7"/>
   </w:num>
   <w:num w:numId="10" w16cid:durableId="242104952">
     <w:abstractNumId w:val="2"/>
+  </w:num>
+  <w:num w:numId="11" w16cid:durableId="1881168213">
+    <w:abstractNumId w:val="6"/>
+  </w:num>
+  <w:num w:numId="12" w16cid:durableId="270628355">
+    <w:abstractNumId w:val="10"/>
+  </w:num>
+  <w:num w:numId="13" w16cid:durableId="445125503">
+    <w:abstractNumId w:val="5"/>
+  </w:num>
+  <w:num w:numId="14" w16cid:durableId="1733507975">
+    <w:abstractNumId w:val="3"/>
   </w:num>
 </w:numbering>
 </file>

</xml_diff>